<commit_message>
Fix invoice Word doc: resolve undefined values and hardcoded template data
- documentGenerator.ts: add clientName/branch (template uses these, code was passing dealerName/area), and top-level sku/description/quantity/unitPrice/amount/totalAmount/amountInWords (placeholders exist outside the {#items} loop)
- invoice-template.docx: replace hardcoded 'Elma 500 ml', '5900', and 'Five Thousand Nine Hundred...' with {description}, {totalAmount}, {amountInWords} placeholders

Co-Authored-By: Claude Sonnet 4.6 <noreply@anthropic.com>
</commit_message>
<xml_diff>
--- a/public/templates/invoice-template.docx
+++ b/public/templates/invoice-template.docx
@@ -561,16 +561,7 @@
                 <w:rFonts w:eastAsiaTheme="minorEastAsia"/>
                 <w:color w:val="000000" w:themeColor="text1"/>
               </w:rPr>
-              <w:t xml:space="preserve">Elma </w:t>
-            </w:r>
-            <w:r>
-              <w:rPr>
-                <w:rFonts w:eastAsiaTheme="minorEastAsia"/>
-                <w:b/>
-                <w:bCs/>
-                <w:color w:val="000000" w:themeColor="text1"/>
-              </w:rPr>
-              <w:t>500 ml</w:t>
+              <w:t>{description}</w:t>
             </w:r>
           </w:p>
         </w:tc>
@@ -872,7 +863,7 @@
                 <w:bCs/>
                 <w:color w:val="000000" w:themeColor="text1"/>
               </w:rPr>
-              <w:t>5900</w:t>
+              <w:t>{totalAmount}</w:t>
             </w:r>
           </w:p>
           <w:p>
@@ -891,63 +882,10 @@
     </w:tbl>
     <w:p>
       <w:r>
-        <w:t>Amount in words:</w:t>
-      </w:r>
-      <w:r>
-        <w:t xml:space="preserve"> </w:t>
-      </w:r>
-      <w:r>
-        <w:t>F</w:t>
-      </w:r>
-      <w:r>
-        <w:t>ive</w:t>
-      </w:r>
-      <w:r>
-        <w:t xml:space="preserve"> T</w:t>
-      </w:r>
-      <w:r>
-        <w:t>housand</w:t>
-      </w:r>
-      <w:r>
-        <w:t xml:space="preserve"> </w:t>
-      </w:r>
-      <w:r>
-        <w:t>Nine</w:t>
-      </w:r>
-      <w:r>
-        <w:t xml:space="preserve"> </w:t>
-      </w:r>
-      <w:r>
-        <w:t>Hundred</w:t>
-      </w:r>
-      <w:r>
-        <w:t xml:space="preserve"> </w:t>
-      </w:r>
-      <w:r>
-        <w:t xml:space="preserve"> </w:t>
-      </w:r>
-      <w:r>
-        <w:t>Only</w:t>
-      </w:r>
-      <w:r>
-        <w:t xml:space="preserve">: </w:t>
-      </w:r>
-      <w:r>
-        <w:rPr>
-          <w:b/>
-          <w:bCs/>
-        </w:rPr>
-        <w:t>Rs.</w:t>
-      </w:r>
-      <w:r>
-        <w:rPr>
-          <w:b/>
-          <w:bCs/>
-        </w:rPr>
-        <w:t>5900</w:t>
-      </w:r>
-      <w:r>
-        <w:t>/-</w:t>
+        <w:t xml:space="preserve">Amount in words: </w:t>
+      </w:r>
+      <w:r>
+        <w:t>{amountInWords}</w:t>
       </w:r>
     </w:p>
     <w:p>

</xml_diff>

<commit_message>
Fix DOCX template: add proper {#items} loop so all SKUs render as separate line items
The template had a fake '{#items}...{/items}' placeholder paragraph
that did nothing. Item rows used top-level variables (first SKU only).
Now the loop correctly wraps the TR so each item in the array gets
its own row, and {sno} replaces the hardcoded '1.'.
</commit_message>
<xml_diff>
--- a/public/templates/invoice-template.docx
+++ b/public/templates/invoice-template.docx
@@ -244,20 +244,6 @@
           <w:color w:val="000000" w:themeColor="text1"/>
         </w:rPr>
         <w:t>Dispatch Through: AUTO</w:t>
-      </w:r>
-    </w:p>
-    <w:p>
-      <w:pPr>
-        <w:spacing w:after="0" w:line="360" w:lineRule="auto"/>
-        <w:rPr>
-          <w:rFonts w:eastAsiaTheme="minorEastAsia"/>
-        </w:rPr>
-      </w:pPr>
-      <w:r>
-        <w:rPr>
-          <w:rFonts w:eastAsiaTheme="minorEastAsia"/>
-        </w:rPr>
-        <w:t>{#items}...{/items}</w:t>
       </w:r>
     </w:p>
     <w:tbl>
@@ -529,7 +515,7 @@
                 <w:rFonts w:eastAsiaTheme="minorEastAsia"/>
                 <w:color w:val="000000" w:themeColor="text1"/>
               </w:rPr>
-              <w:t>1.</w:t>
+              <w:t>{#items}{sno}.</w:t>
             </w:r>
           </w:p>
         </w:tc>
@@ -694,7 +680,7 @@
                 <w:rFonts w:ascii="Calibri" w:hAnsi="Calibri" w:cs="Calibri"/>
                 <w:color w:val="000000" w:themeColor="text1"/>
               </w:rPr>
-              <w:t>{amount}</w:t>
+              <w:t>{amount}{/items}</w:t>
             </w:r>
           </w:p>
         </w:tc>

</xml_diff>

<commit_message>
Fix SKU column borders, and correct amountInWords calculation
- DOCX: fix 3 SKU column cells (header + data rows) that had thin
  auto-coloured borders instead of the standard thick black borders
- invoiceService: rewrite convertNumberToWords — old code used %100
  at base level, treating e.g. 369 as 3 thousands + 69 (Three Thousand
  Sixty Nine) instead of Three Hundred Sixty Nine
</commit_message>
<xml_diff>
--- a/public/templates/invoice-template.docx
+++ b/public/templates/invoice-template.docx
@@ -343,10 +343,10 @@
           <w:tcPr>
             <w:tcW w:w="1200" w:type="dxa"/>
             <w:tcBorders>
-              <w:top w:val="single" w:sz="4" w:space="0" w:color="auto"/>
-              <w:left w:val="single" w:sz="4" w:space="0" w:color="auto"/>
-              <w:bottom w:val="single" w:sz="4" w:space="0" w:color="auto"/>
-              <w:right w:val="single" w:sz="4" w:space="0" w:color="auto"/>
+              <w:top w:val="single" w:sz="8" w:space="0" w:color="000000" w:themeColor="text1"/>
+              <w:left w:val="single" w:sz="8" w:space="0" w:color="000000" w:themeColor="text1"/>
+              <w:bottom w:val="single" w:sz="8" w:space="0" w:color="000000" w:themeColor="text1"/>
+              <w:right w:val="single" w:sz="8" w:space="0" w:color="000000" w:themeColor="text1"/>
             </w:tcBorders>
           </w:tcPr>
           <w:p>
@@ -555,10 +555,10 @@
           <w:tcPr>
             <w:tcW w:w="1200" w:type="dxa"/>
             <w:tcBorders>
-              <w:top w:val="single" w:sz="4" w:space="0" w:color="auto"/>
-              <w:left w:val="single" w:sz="4" w:space="0" w:color="auto"/>
-              <w:bottom w:val="single" w:sz="4" w:space="0" w:color="auto"/>
-              <w:right w:val="single" w:sz="4" w:space="0" w:color="auto"/>
+              <w:top w:val="single" w:sz="8" w:space="0" w:color="000000" w:themeColor="text1"/>
+              <w:left w:val="single" w:sz="8" w:space="0" w:color="000000" w:themeColor="text1"/>
+              <w:bottom w:val="single" w:sz="8" w:space="0" w:color="000000" w:themeColor="text1"/>
+              <w:right w:val="single" w:sz="8" w:space="0" w:color="000000" w:themeColor="text1"/>
             </w:tcBorders>
           </w:tcPr>
           <w:p>
@@ -754,10 +754,10 @@
           <w:tcPr>
             <w:tcW w:w="1200" w:type="dxa"/>
             <w:tcBorders>
-              <w:top w:val="single" w:sz="4" w:space="0" w:color="auto"/>
-              <w:left w:val="single" w:sz="4" w:space="0" w:color="auto"/>
-              <w:bottom w:val="single" w:sz="4" w:space="0" w:color="auto"/>
-              <w:right w:val="single" w:sz="4" w:space="0" w:color="auto"/>
+              <w:top w:val="single" w:sz="8" w:space="0" w:color="000000" w:themeColor="text1"/>
+              <w:left w:val="single" w:sz="8" w:space="0" w:color="000000" w:themeColor="text1"/>
+              <w:bottom w:val="single" w:sz="8" w:space="0" w:color="000000" w:themeColor="text1"/>
+              <w:right w:val="single" w:sz="8" w:space="0" w:color="000000" w:themeColor="text1"/>
             </w:tcBorders>
           </w:tcPr>
           <w:p>

</xml_diff>